<commit_message>
Avance en evaluación y recálculo en cadena
</commit_message>
<xml_diff>
--- a/Bitacora/5.6 Bitácora de desarrollo.docx
+++ b/Bitacora/5.6 Bitácora de desarrollo.docx
@@ -5,36 +5,52 @@
     <w:p>
       <w:pPr>
         <w:rPr>
-          <w:sz w:val="32"/>
-          <w:szCs w:val="32"/>
-        </w:rPr>
-      </w:pPr>
-      <w:r>
-        <w:rPr>
-          <w:sz w:val="32"/>
-          <w:szCs w:val="32"/>
+          <w:rFonts w:ascii="Times New Roman" w:hAnsi="Times New Roman" w:cs="Times New Roman"/>
+        </w:rPr>
+      </w:pPr>
+      <w:r>
+        <w:rPr>
+          <w:rFonts w:ascii="Times New Roman" w:hAnsi="Times New Roman" w:cs="Times New Roman"/>
         </w:rPr>
         <w:t>5.6 Bitácora de desarrollo</w:t>
       </w:r>
     </w:p>
     <w:p>
-      <w:r>
+      <w:pPr>
+        <w:rPr>
+          <w:rFonts w:ascii="Times New Roman" w:hAnsi="Times New Roman" w:cs="Times New Roman"/>
+        </w:rPr>
+      </w:pPr>
+      <w:r>
+        <w:rPr>
+          <w:rFonts w:ascii="Times New Roman" w:hAnsi="Times New Roman" w:cs="Times New Roman"/>
+        </w:rPr>
         <w:t xml:space="preserve">Con el propósito de llevar un control ordenado del desarrollo del proyecto, se tomó la iniciativa de utilizar </w:t>
       </w:r>
       <w:r>
         <w:rPr>
+          <w:rFonts w:ascii="Times New Roman" w:hAnsi="Times New Roman" w:cs="Times New Roman"/>
           <w:b/>
           <w:bCs/>
         </w:rPr>
         <w:t>Jira</w:t>
       </w:r>
       <w:r>
+        <w:rPr>
+          <w:rFonts w:ascii="Times New Roman" w:hAnsi="Times New Roman" w:cs="Times New Roman"/>
+        </w:rPr>
         <w:t xml:space="preserve"> como herramienta de gestión y seguimiento. En esta plataforma se registraron las actividades, avances, tareas pendientes y diferentes etapas realizadas durante el desarrollo del proyecto.</w:t>
       </w:r>
     </w:p>
     <w:p>
-      <w:r>
-        <w:rPr>
+      <w:pPr>
+        <w:rPr>
+          <w:rFonts w:ascii="Times New Roman" w:hAnsi="Times New Roman" w:cs="Times New Roman"/>
+        </w:rPr>
+      </w:pPr>
+      <w:r>
+        <w:rPr>
+          <w:rFonts w:ascii="Times New Roman" w:hAnsi="Times New Roman" w:cs="Times New Roman"/>
           <w:b/>
           <w:bCs/>
         </w:rPr>
@@ -42,10 +58,16 @@
       </w:r>
     </w:p>
     <w:p>
-      <w:hyperlink r:id="rId4" w:history="1">
+      <w:pPr>
+        <w:rPr>
+          <w:rFonts w:ascii="Times New Roman" w:hAnsi="Times New Roman" w:cs="Times New Roman"/>
+        </w:rPr>
+      </w:pPr>
+      <w:hyperlink r:id="rId5" w:history="1">
         <w:r>
           <w:rPr>
             <w:rStyle w:val="Hipervnculo"/>
+            <w:rFonts w:ascii="Times New Roman" w:hAnsi="Times New Roman" w:cs="Times New Roman"/>
           </w:rPr>
           <w:t>https://samuelmuj.atlassian.net/jira/core/projects/EJ/timeline?atlOrigin=eyJpIjoiYWMwZjk4Y2JiNWRhNGRkZWJlNTNhNDZlNmQ0MWJkMTQiLCJwIjoiaiJ9</w:t>
         </w:r>
@@ -54,12 +76,14 @@
     <w:p>
       <w:pPr>
         <w:rPr>
+          <w:rFonts w:ascii="Times New Roman" w:hAnsi="Times New Roman" w:cs="Times New Roman"/>
           <w:b/>
           <w:bCs/>
         </w:rPr>
       </w:pPr>
       <w:r>
         <w:rPr>
+          <w:rFonts w:ascii="Times New Roman" w:hAnsi="Times New Roman" w:cs="Times New Roman"/>
           <w:b/>
           <w:bCs/>
         </w:rPr>
@@ -67,19 +91,29 @@
       </w:r>
     </w:p>
     <w:p>
-      <w:r>
+      <w:pPr>
+        <w:rPr>
+          <w:rFonts w:ascii="Times New Roman" w:hAnsi="Times New Roman" w:cs="Times New Roman"/>
+        </w:rPr>
+      </w:pPr>
+      <w:r>
+        <w:rPr>
+          <w:rFonts w:ascii="Times New Roman" w:hAnsi="Times New Roman" w:cs="Times New Roman"/>
+        </w:rPr>
         <w:t>Se realizó un análisis inicial en papel sobre los requerimientos necesarios para cumplir con las indicaciones de Silvia Xitumul.</w:t>
       </w:r>
     </w:p>
     <w:p>
       <w:pPr>
         <w:rPr>
+          <w:rFonts w:ascii="Times New Roman" w:hAnsi="Times New Roman" w:cs="Times New Roman"/>
           <w:b/>
           <w:bCs/>
         </w:rPr>
       </w:pPr>
       <w:r>
         <w:rPr>
+          <w:rFonts w:ascii="Times New Roman" w:hAnsi="Times New Roman" w:cs="Times New Roman"/>
           <w:b/>
           <w:bCs/>
         </w:rPr>
@@ -87,19 +121,29 @@
       </w:r>
     </w:p>
     <w:p>
-      <w:r>
+      <w:pPr>
+        <w:rPr>
+          <w:rFonts w:ascii="Times New Roman" w:hAnsi="Times New Roman" w:cs="Times New Roman"/>
+        </w:rPr>
+      </w:pPr>
+      <w:r>
+        <w:rPr>
+          <w:rFonts w:ascii="Times New Roman" w:hAnsi="Times New Roman" w:cs="Times New Roman"/>
+        </w:rPr>
         <w:t>Se definieron las actividades principales y se estableció una estructura inicial de trabajo. También se realizaron los primeros avances y se subieron a GitHub, aunque la organización del proyecto aún no estaba completamente definida.</w:t>
       </w:r>
     </w:p>
     <w:p>
       <w:pPr>
         <w:rPr>
+          <w:rFonts w:ascii="Times New Roman" w:hAnsi="Times New Roman" w:cs="Times New Roman"/>
           <w:b/>
           <w:bCs/>
         </w:rPr>
       </w:pPr>
       <w:r>
         <w:rPr>
+          <w:rFonts w:ascii="Times New Roman" w:hAnsi="Times New Roman" w:cs="Times New Roman"/>
           <w:b/>
           <w:bCs/>
         </w:rPr>
@@ -107,85 +151,85 @@
       </w:r>
     </w:p>
     <w:p>
-      <w:r>
+      <w:pPr>
+        <w:rPr>
+          <w:rFonts w:ascii="Times New Roman" w:hAnsi="Times New Roman" w:cs="Times New Roman"/>
+        </w:rPr>
+      </w:pPr>
+      <w:r>
+        <w:rPr>
+          <w:rFonts w:ascii="Times New Roman" w:hAnsi="Times New Roman" w:cs="Times New Roman"/>
+        </w:rPr>
         <w:t xml:space="preserve">Se realizó la lectura del libro </w:t>
       </w:r>
       <w:r>
         <w:rPr>
+          <w:rFonts w:ascii="Times New Roman" w:hAnsi="Times New Roman" w:cs="Times New Roman"/>
           <w:i/>
           <w:iCs/>
         </w:rPr>
         <w:t>Programación en Turbo/Borland Pascal 7, 3.ª edición</w:t>
       </w:r>
       <w:r>
+        <w:rPr>
+          <w:rFonts w:ascii="Times New Roman" w:hAnsi="Times New Roman" w:cs="Times New Roman"/>
+        </w:rPr>
         <w:t>, con el objetivo de resolver dudas relacionadas con la estructura del análisis y diseño del proyecto.</w:t>
       </w:r>
     </w:p>
     <w:p>
       <w:pPr>
         <w:rPr>
+          <w:rFonts w:ascii="Times New Roman" w:hAnsi="Times New Roman" w:cs="Times New Roman"/>
           <w:b/>
           <w:bCs/>
         </w:rPr>
       </w:pPr>
       <w:r>
         <w:rPr>
+          <w:rFonts w:ascii="Times New Roman" w:hAnsi="Times New Roman" w:cs="Times New Roman"/>
           <w:b/>
           <w:bCs/>
         </w:rPr>
-        <w:t xml:space="preserve">Día </w:t>
-      </w:r>
-      <w:r>
-        <w:rPr>
-          <w:b/>
-          <w:bCs/>
-        </w:rPr>
-        <w:t>4</w:t>
-      </w:r>
-      <w:r>
-        <w:rPr>
-          <w:b/>
-          <w:bCs/>
-        </w:rPr>
-        <w:t xml:space="preserve"> – </w:t>
-      </w:r>
-      <w:r>
-        <w:rPr>
-          <w:b/>
-          <w:bCs/>
-        </w:rPr>
-        <w:t>31</w:t>
-      </w:r>
-      <w:r>
-        <w:rPr>
-          <w:b/>
-          <w:bCs/>
-        </w:rPr>
-        <w:t>-08-2026</w:t>
-      </w:r>
-    </w:p>
-    <w:p>
-      <w:r>
-        <w:t xml:space="preserve">Proceso de análisis y diseño en </w:t>
-      </w:r>
-      <w:r>
-        <w:t>5.2 Diagramas de flujo (PSeInt</w:t>
+        <w:t>Día 4 – 31-08-2026</w:t>
+      </w:r>
+    </w:p>
+    <w:p>
+      <w:pPr>
+        <w:rPr>
+          <w:rFonts w:ascii="Times New Roman" w:hAnsi="Times New Roman" w:cs="Times New Roman"/>
+        </w:rPr>
+      </w:pPr>
+      <w:r>
+        <w:rPr>
+          <w:rFonts w:ascii="Times New Roman" w:hAnsi="Times New Roman" w:cs="Times New Roman"/>
+        </w:rPr>
+        <w:t>Proceso de análisis y diseño en 5.2 Diagramas de flujo (PSeInt</w:t>
       </w:r>
       <w:proofErr w:type="gramStart"/>
       <w:r>
-        <w:t>)</w:t>
-      </w:r>
-      <w:r>
-        <w:t>(</w:t>
+        <w:rPr>
+          <w:rFonts w:ascii="Times New Roman" w:hAnsi="Times New Roman" w:cs="Times New Roman"/>
+        </w:rPr>
+        <w:t>)(</w:t>
       </w:r>
       <w:proofErr w:type="gramEnd"/>
       <w:r>
+        <w:rPr>
+          <w:rFonts w:ascii="Times New Roman" w:hAnsi="Times New Roman" w:cs="Times New Roman"/>
+        </w:rPr>
         <w:t>inciso 1 y 2)</w:t>
       </w:r>
     </w:p>
     <w:p>
-      <w:r>
-        <w:rPr>
+      <w:pPr>
+        <w:rPr>
+          <w:rFonts w:ascii="Times New Roman" w:hAnsi="Times New Roman" w:cs="Times New Roman"/>
+        </w:rPr>
+      </w:pPr>
+      <w:r>
+        <w:rPr>
+          <w:rFonts w:ascii="Times New Roman" w:hAnsi="Times New Roman" w:cs="Times New Roman"/>
           <w:noProof/>
         </w:rPr>
         <w:drawing>
@@ -212,7 +256,7 @@
                     <pic:cNvPicPr/>
                   </pic:nvPicPr>
                   <pic:blipFill>
-                    <a:blip r:embed="rId5" cstate="print">
+                    <a:blip r:embed="rId6" cstate="print">
                       <a:extLst>
                         <a:ext uri="{28A0092B-C50C-407E-A947-70E740481C1C}">
                           <a14:useLocalDpi xmlns:a14="http://schemas.microsoft.com/office/drawing/2010/main" val="0"/>
@@ -245,20 +289,343 @@
         </w:drawing>
       </w:r>
       <w:r>
+        <w:rPr>
+          <w:rFonts w:ascii="Times New Roman" w:hAnsi="Times New Roman" w:cs="Times New Roman"/>
+        </w:rPr>
         <w:t>Se lleva la gestión en Jira para cumplir con cronograma.</w:t>
       </w:r>
     </w:p>
-    <w:p/>
-    <w:p>
-      <w:pPr>
-        <w:rPr>
+    <w:p>
+      <w:pPr>
+        <w:rPr>
+          <w:rFonts w:ascii="Times New Roman" w:hAnsi="Times New Roman" w:cs="Times New Roman"/>
+        </w:rPr>
+      </w:pPr>
+    </w:p>
+    <w:p>
+      <w:pPr>
+        <w:rPr>
+          <w:rFonts w:ascii="Times New Roman" w:hAnsi="Times New Roman" w:cs="Times New Roman"/>
+        </w:rPr>
+      </w:pPr>
+    </w:p>
+    <w:p>
+      <w:pPr>
+        <w:rPr>
+          <w:rFonts w:ascii="Times New Roman" w:hAnsi="Times New Roman" w:cs="Times New Roman"/>
+        </w:rPr>
+      </w:pPr>
+    </w:p>
+    <w:p>
+      <w:pPr>
+        <w:rPr>
+          <w:rFonts w:ascii="Times New Roman" w:hAnsi="Times New Roman" w:cs="Times New Roman"/>
+        </w:rPr>
+      </w:pPr>
+    </w:p>
+    <w:p>
+      <w:pPr>
+        <w:rPr>
+          <w:rFonts w:ascii="Times New Roman" w:hAnsi="Times New Roman" w:cs="Times New Roman"/>
+        </w:rPr>
+      </w:pPr>
+    </w:p>
+    <w:p>
+      <w:pPr>
+        <w:spacing w:after="0"/>
+        <w:rPr>
+          <w:rFonts w:ascii="Times New Roman" w:hAnsi="Times New Roman" w:cs="Times New Roman"/>
           <w:b/>
           <w:bCs/>
         </w:rPr>
       </w:pPr>
-    </w:p>
-    <w:p/>
-    <w:p/>
+      <w:r>
+        <w:rPr>
+          <w:rFonts w:ascii="Times New Roman" w:hAnsi="Times New Roman" w:cs="Times New Roman"/>
+          <w:b/>
+          <w:bCs/>
+        </w:rPr>
+        <w:lastRenderedPageBreak/>
+        <w:t>Día 5 – 01-09-2026</w:t>
+      </w:r>
+    </w:p>
+    <w:p>
+      <w:pPr>
+        <w:spacing w:after="0"/>
+        <w:rPr>
+          <w:rFonts w:ascii="Times New Roman" w:hAnsi="Times New Roman" w:cs="Times New Roman"/>
+        </w:rPr>
+      </w:pPr>
+    </w:p>
+    <w:p>
+      <w:pPr>
+        <w:spacing w:after="0"/>
+        <w:rPr>
+          <w:rFonts w:ascii="Times New Roman" w:hAnsi="Times New Roman" w:cs="Times New Roman"/>
+        </w:rPr>
+      </w:pPr>
+      <w:r>
+        <w:rPr>
+          <w:rFonts w:ascii="Times New Roman" w:hAnsi="Times New Roman" w:cs="Times New Roman"/>
+        </w:rPr>
+        <w:t xml:space="preserve">Avance: Se trabajó en el punto 3, evaluación de la expresión </w:t>
+      </w:r>
+      <w:proofErr w:type="spellStart"/>
+      <w:r>
+        <w:rPr>
+          <w:rFonts w:ascii="Times New Roman" w:hAnsi="Times New Roman" w:cs="Times New Roman"/>
+        </w:rPr>
+        <w:t>tokenizada</w:t>
+      </w:r>
+      <w:proofErr w:type="spellEnd"/>
+      <w:r>
+        <w:rPr>
+          <w:rFonts w:ascii="Times New Roman" w:hAnsi="Times New Roman" w:cs="Times New Roman"/>
+        </w:rPr>
+        <w:t>.</w:t>
+      </w:r>
+    </w:p>
+    <w:p>
+      <w:pPr>
+        <w:spacing w:after="0"/>
+        <w:rPr>
+          <w:rFonts w:ascii="Times New Roman" w:hAnsi="Times New Roman" w:cs="Times New Roman"/>
+        </w:rPr>
+      </w:pPr>
+      <w:r>
+        <w:rPr>
+          <w:rFonts w:ascii="Times New Roman" w:hAnsi="Times New Roman" w:cs="Times New Roman"/>
+        </w:rPr>
+        <w:t>Problema encontrado: Fue necesario asegurar que las operaciones respetaran la precedencia matemática.</w:t>
+      </w:r>
+    </w:p>
+    <w:p>
+      <w:pPr>
+        <w:spacing w:after="0"/>
+        <w:rPr>
+          <w:rFonts w:ascii="Times New Roman" w:hAnsi="Times New Roman" w:cs="Times New Roman"/>
+        </w:rPr>
+      </w:pPr>
+      <w:r>
+        <w:rPr>
+          <w:rFonts w:ascii="Times New Roman" w:hAnsi="Times New Roman" w:cs="Times New Roman"/>
+        </w:rPr>
+        <w:t>Decisión y solución: Se separó la evaluación en funciones para organizar mejor el proceso y controlar el orden de las operaciones.</w:t>
+      </w:r>
+    </w:p>
+    <w:p>
+      <w:pPr>
+        <w:spacing w:after="0"/>
+        <w:rPr>
+          <w:rFonts w:ascii="Times New Roman" w:hAnsi="Times New Roman" w:cs="Times New Roman"/>
+        </w:rPr>
+      </w:pPr>
+    </w:p>
+    <w:p>
+      <w:pPr>
+        <w:spacing w:after="0"/>
+        <w:rPr>
+          <w:rFonts w:ascii="Times New Roman" w:hAnsi="Times New Roman" w:cs="Times New Roman"/>
+          <w:b/>
+          <w:bCs/>
+        </w:rPr>
+      </w:pPr>
+      <w:r>
+        <w:rPr>
+          <w:rFonts w:ascii="Times New Roman" w:hAnsi="Times New Roman" w:cs="Times New Roman"/>
+          <w:b/>
+          <w:bCs/>
+        </w:rPr>
+        <w:t>Día 6 – 01-09-2026</w:t>
+      </w:r>
+    </w:p>
+    <w:p>
+      <w:pPr>
+        <w:spacing w:after="0"/>
+        <w:rPr>
+          <w:rFonts w:ascii="Times New Roman" w:hAnsi="Times New Roman" w:cs="Times New Roman"/>
+        </w:rPr>
+      </w:pPr>
+    </w:p>
+    <w:p>
+      <w:pPr>
+        <w:spacing w:after="0"/>
+        <w:rPr>
+          <w:rFonts w:ascii="Times New Roman" w:hAnsi="Times New Roman" w:cs="Times New Roman"/>
+        </w:rPr>
+      </w:pPr>
+      <w:r>
+        <w:rPr>
+          <w:rFonts w:ascii="Times New Roman" w:hAnsi="Times New Roman" w:cs="Times New Roman"/>
+        </w:rPr>
+        <w:t>Avance: Se desarrolló el punto 4, recálculo en cadena, utilizando las dependencias A1 → C3 → D4.</w:t>
+      </w:r>
+    </w:p>
+    <w:p>
+      <w:pPr>
+        <w:spacing w:after="0"/>
+        <w:rPr>
+          <w:rFonts w:ascii="Times New Roman" w:hAnsi="Times New Roman" w:cs="Times New Roman"/>
+        </w:rPr>
+      </w:pPr>
+      <w:r>
+        <w:rPr>
+          <w:rFonts w:ascii="Times New Roman" w:hAnsi="Times New Roman" w:cs="Times New Roman"/>
+        </w:rPr>
+        <w:t>Problema encontrado: Al modificar una celda, era necesario actualizar también las celdas que dependían de ella.</w:t>
+      </w:r>
+    </w:p>
+    <w:p>
+      <w:pPr>
+        <w:spacing w:after="0"/>
+        <w:rPr>
+          <w:rFonts w:ascii="Times New Roman" w:hAnsi="Times New Roman" w:cs="Times New Roman"/>
+        </w:rPr>
+      </w:pPr>
+      <w:r>
+        <w:rPr>
+          <w:rFonts w:ascii="Times New Roman" w:hAnsi="Times New Roman" w:cs="Times New Roman"/>
+        </w:rPr>
+        <w:t xml:space="preserve">Decisión y solución: Se implementó </w:t>
+      </w:r>
+      <w:proofErr w:type="spellStart"/>
+      <w:r>
+        <w:rPr>
+          <w:rFonts w:ascii="Times New Roman" w:hAnsi="Times New Roman" w:cs="Times New Roman"/>
+        </w:rPr>
+        <w:t>PropagarCambios</w:t>
+      </w:r>
+      <w:proofErr w:type="spellEnd"/>
+      <w:r>
+        <w:rPr>
+          <w:rFonts w:ascii="Times New Roman" w:hAnsi="Times New Roman" w:cs="Times New Roman"/>
+        </w:rPr>
+        <w:t xml:space="preserve"> para recorrer las dependencias y recalcular las celdas en el orden correspondiente.</w:t>
+      </w:r>
+    </w:p>
+    <w:p>
+      <w:pPr>
+        <w:rPr>
+          <w:rFonts w:ascii="Times New Roman" w:hAnsi="Times New Roman" w:cs="Times New Roman"/>
+        </w:rPr>
+      </w:pPr>
+    </w:p>
+    <w:p>
+      <w:pPr>
+        <w:rPr>
+          <w:rFonts w:ascii="Times New Roman" w:hAnsi="Times New Roman" w:cs="Times New Roman"/>
+        </w:rPr>
+      </w:pPr>
+      <w:r>
+        <w:rPr>
+          <w:rFonts w:ascii="Times New Roman" w:hAnsi="Times New Roman" w:cs="Times New Roman"/>
+        </w:rPr>
+        <w:drawing>
+          <wp:anchor distT="0" distB="0" distL="114300" distR="114300" simplePos="0" relativeHeight="251659264" behindDoc="0" locked="0" layoutInCell="1" allowOverlap="1" wp14:anchorId="5EDAB565" wp14:editId="1E4EA3AB">
+            <wp:simplePos x="0" y="0"/>
+            <wp:positionH relativeFrom="margin">
+              <wp:align>center</wp:align>
+            </wp:positionH>
+            <wp:positionV relativeFrom="paragraph">
+              <wp:posOffset>653415</wp:posOffset>
+            </wp:positionV>
+            <wp:extent cx="7253993" cy="1587500"/>
+            <wp:effectExtent l="0" t="0" r="4445" b="0"/>
+            <wp:wrapTopAndBottom/>
+            <wp:docPr id="1736639676" name="Imagen 2"/>
+            <wp:cNvGraphicFramePr>
+              <a:graphicFrameLocks xmlns:a="http://schemas.openxmlformats.org/drawingml/2006/main" noChangeAspect="1"/>
+            </wp:cNvGraphicFramePr>
+            <a:graphic xmlns:a="http://schemas.openxmlformats.org/drawingml/2006/main">
+              <a:graphicData uri="http://schemas.openxmlformats.org/drawingml/2006/picture">
+                <pic:pic xmlns:pic="http://schemas.openxmlformats.org/drawingml/2006/picture">
+                  <pic:nvPicPr>
+                    <pic:cNvPr id="0" name="Picture 6"/>
+                    <pic:cNvPicPr>
+                      <a:picLocks noChangeAspect="1" noChangeArrowheads="1"/>
+                    </pic:cNvPicPr>
+                  </pic:nvPicPr>
+                  <pic:blipFill>
+                    <a:blip r:embed="rId7">
+                      <a:extLst>
+                        <a:ext uri="{28A0092B-C50C-407E-A947-70E740481C1C}">
+                          <a14:useLocalDpi xmlns:a14="http://schemas.microsoft.com/office/drawing/2010/main" val="0"/>
+                        </a:ext>
+                      </a:extLst>
+                    </a:blip>
+                    <a:srcRect/>
+                    <a:stretch>
+                      <a:fillRect/>
+                    </a:stretch>
+                  </pic:blipFill>
+                  <pic:spPr bwMode="auto">
+                    <a:xfrm>
+                      <a:off x="0" y="0"/>
+                      <a:ext cx="7253993" cy="1587500"/>
+                    </a:xfrm>
+                    <a:prstGeom prst="rect">
+                      <a:avLst/>
+                    </a:prstGeom>
+                    <a:noFill/>
+                    <a:ln>
+                      <a:noFill/>
+                    </a:ln>
+                  </pic:spPr>
+                </pic:pic>
+              </a:graphicData>
+            </a:graphic>
+            <wp14:sizeRelH relativeFrom="margin">
+              <wp14:pctWidth>0</wp14:pctWidth>
+            </wp14:sizeRelH>
+            <wp14:sizeRelV relativeFrom="margin">
+              <wp14:pctHeight>0</wp14:pctHeight>
+            </wp14:sizeRelV>
+          </wp:anchor>
+        </w:drawing>
+      </w:r>
+      <w:r>
+        <w:rPr>
+          <w:rFonts w:ascii="Times New Roman" w:hAnsi="Times New Roman" w:cs="Times New Roman"/>
+          <w:b/>
+          <w:bCs/>
+        </w:rPr>
+        <w:t>Nota:</w:t>
+      </w:r>
+      <w:r>
+        <w:rPr>
+          <w:rFonts w:ascii="Times New Roman" w:hAnsi="Times New Roman" w:cs="Times New Roman"/>
+        </w:rPr>
+        <w:t xml:space="preserve"> Se tenía planificado finalizar con el punto </w:t>
+      </w:r>
+      <w:r>
+        <w:rPr>
+          <w:rFonts w:ascii="Times New Roman" w:hAnsi="Times New Roman" w:cs="Times New Roman"/>
+          <w:b/>
+          <w:bCs/>
+        </w:rPr>
+        <w:t>5: Detección de referencias circulares</w:t>
+      </w:r>
+      <w:r>
+        <w:rPr>
+          <w:rFonts w:ascii="Times New Roman" w:hAnsi="Times New Roman" w:cs="Times New Roman"/>
+        </w:rPr>
+        <w:t>, pero debido al tiempo disponible se aplazó para el día siguiente como tarea pendiente.</w:t>
+      </w:r>
+    </w:p>
+    <w:p>
+      <w:pPr>
+        <w:rPr>
+          <w:rFonts w:ascii="Times New Roman" w:hAnsi="Times New Roman" w:cs="Times New Roman"/>
+        </w:rPr>
+      </w:pPr>
+    </w:p>
+    <w:p>
+      <w:pPr>
+        <w:rPr>
+          <w:rFonts w:ascii="Times New Roman" w:hAnsi="Times New Roman" w:cs="Times New Roman"/>
+        </w:rPr>
+      </w:pPr>
+    </w:p>
     <w:sectPr>
       <w:pgSz w:w="12240" w:h="15840"/>
       <w:pgMar w:top="1417" w:right="1701" w:bottom="1417" w:left="1701" w:header="708" w:footer="708" w:gutter="0"/>
@@ -267,6 +634,315 @@
     </w:sectPr>
   </w:body>
 </w:document>
+</file>
+
+<file path=word/numbering.xml><?xml version="1.0" encoding="utf-8"?>
+<w:numbering xmlns:wpc="http://schemas.microsoft.com/office/word/2010/wordprocessingCanvas" xmlns:cx="http://schemas.microsoft.com/office/drawing/2014/chartex" xmlns:cx1="http://schemas.microsoft.com/office/drawing/2015/9/8/chartex" xmlns:cx2="http://schemas.microsoft.com/office/drawing/2015/10/21/chartex" xmlns:cx3="http://schemas.microsoft.com/office/drawing/2016/5/9/chartex" xmlns:cx4="http://schemas.microsoft.com/office/drawing/2016/5/10/chartex" xmlns:cx5="http://schemas.microsoft.com/office/drawing/2016/5/11/chartex" xmlns:cx6="http://schemas.microsoft.com/office/drawing/2016/5/12/chartex" xmlns:cx7="http://schemas.microsoft.com/office/drawing/2016/5/13/chartex" xmlns:cx8="http://schemas.microsoft.com/office/drawing/2016/5/14/chartex" xmlns:mc="http://schemas.openxmlformats.org/markup-compatibility/2006" xmlns:aink="http://schemas.microsoft.com/office/drawing/2016/ink" xmlns:am3d="http://schemas.microsoft.com/office/drawing/2017/model3d" xmlns:o="urn:schemas-microsoft-com:office:office" xmlns:oel="http://schemas.microsoft.com/office/2019/extlst" xmlns:r="http://schemas.openxmlformats.org/officeDocument/2006/relationships" xmlns:m="http://schemas.openxmlformats.org/officeDocument/2006/math" xmlns:v="urn:schemas-microsoft-com:vml" xmlns:wp14="http://schemas.microsoft.com/office/word/2010/wordprocessingDrawing" xmlns:wp="http://schemas.openxmlformats.org/drawingml/2006/wordprocessingDrawing" xmlns:w10="urn:schemas-microsoft-com:office:word" xmlns:w="http://schemas.openxmlformats.org/wordprocessingml/2006/main" xmlns:w14="http://schemas.microsoft.com/office/word/2010/wordml" xmlns:w15="http://schemas.microsoft.com/office/word/2012/wordml" xmlns:w16cex="http://schemas.microsoft.com/office/word/2018/wordml/cex" xmlns:w16cid="http://schemas.microsoft.com/office/word/2016/wordml/cid" xmlns:w16="http://schemas.microsoft.com/office/word/2018/wordml" xmlns:w16du="http://schemas.microsoft.com/office/word/2023/wordml/word16du" xmlns:w16sdtdh="http://schemas.microsoft.com/office/word/2020/wordml/sdtdatahash" xmlns:w16sdtfl="http://schemas.microsoft.com/office/word/2024/wordml/sdtformatlock" xmlns:w16se="http://schemas.microsoft.com/office/word/2015/wordml/symex" xmlns:wpg="http://schemas.microsoft.com/office/word/2010/wordprocessingGroup" xmlns:wpi="http://schemas.microsoft.com/office/word/2010/wordprocessingInk" xmlns:wne="http://schemas.microsoft.com/office/word/2006/wordml" xmlns:wps="http://schemas.microsoft.com/office/word/2010/wordprocessingShape" mc:Ignorable="w14 w15 w16se w16cid w16 w16cex w16sdtdh w16sdtfl w16du wp14">
+  <w:abstractNum w:abstractNumId="0" w15:restartNumberingAfterBreak="0">
+    <w:nsid w:val="05611656"/>
+    <w:multiLevelType w:val="multilevel"/>
+    <w:tmpl w:val="403CAA08"/>
+    <w:lvl w:ilvl="0">
+      <w:start w:val="1"/>
+      <w:numFmt w:val="bullet"/>
+      <w:lvlText w:val=""/>
+      <w:lvlJc w:val="left"/>
+      <w:pPr>
+        <w:tabs>
+          <w:tab w:val="num" w:pos="720"/>
+        </w:tabs>
+        <w:ind w:left="720" w:hanging="360"/>
+      </w:pPr>
+      <w:rPr>
+        <w:rFonts w:ascii="Symbol" w:hAnsi="Symbol" w:hint="default"/>
+        <w:sz w:val="20"/>
+      </w:rPr>
+    </w:lvl>
+    <w:lvl w:ilvl="1" w:tentative="1">
+      <w:start w:val="1"/>
+      <w:numFmt w:val="bullet"/>
+      <w:lvlText w:val="o"/>
+      <w:lvlJc w:val="left"/>
+      <w:pPr>
+        <w:tabs>
+          <w:tab w:val="num" w:pos="1440"/>
+        </w:tabs>
+        <w:ind w:left="1440" w:hanging="360"/>
+      </w:pPr>
+      <w:rPr>
+        <w:rFonts w:ascii="Courier New" w:hAnsi="Courier New" w:hint="default"/>
+        <w:sz w:val="20"/>
+      </w:rPr>
+    </w:lvl>
+    <w:lvl w:ilvl="2" w:tentative="1">
+      <w:start w:val="1"/>
+      <w:numFmt w:val="bullet"/>
+      <w:lvlText w:val=""/>
+      <w:lvlJc w:val="left"/>
+      <w:pPr>
+        <w:tabs>
+          <w:tab w:val="num" w:pos="2160"/>
+        </w:tabs>
+        <w:ind w:left="2160" w:hanging="360"/>
+      </w:pPr>
+      <w:rPr>
+        <w:rFonts w:ascii="Wingdings" w:hAnsi="Wingdings" w:hint="default"/>
+        <w:sz w:val="20"/>
+      </w:rPr>
+    </w:lvl>
+    <w:lvl w:ilvl="3" w:tentative="1">
+      <w:start w:val="1"/>
+      <w:numFmt w:val="bullet"/>
+      <w:lvlText w:val=""/>
+      <w:lvlJc w:val="left"/>
+      <w:pPr>
+        <w:tabs>
+          <w:tab w:val="num" w:pos="2880"/>
+        </w:tabs>
+        <w:ind w:left="2880" w:hanging="360"/>
+      </w:pPr>
+      <w:rPr>
+        <w:rFonts w:ascii="Wingdings" w:hAnsi="Wingdings" w:hint="default"/>
+        <w:sz w:val="20"/>
+      </w:rPr>
+    </w:lvl>
+    <w:lvl w:ilvl="4" w:tentative="1">
+      <w:start w:val="1"/>
+      <w:numFmt w:val="bullet"/>
+      <w:lvlText w:val=""/>
+      <w:lvlJc w:val="left"/>
+      <w:pPr>
+        <w:tabs>
+          <w:tab w:val="num" w:pos="3600"/>
+        </w:tabs>
+        <w:ind w:left="3600" w:hanging="360"/>
+      </w:pPr>
+      <w:rPr>
+        <w:rFonts w:ascii="Wingdings" w:hAnsi="Wingdings" w:hint="default"/>
+        <w:sz w:val="20"/>
+      </w:rPr>
+    </w:lvl>
+    <w:lvl w:ilvl="5" w:tentative="1">
+      <w:start w:val="1"/>
+      <w:numFmt w:val="bullet"/>
+      <w:lvlText w:val=""/>
+      <w:lvlJc w:val="left"/>
+      <w:pPr>
+        <w:tabs>
+          <w:tab w:val="num" w:pos="4320"/>
+        </w:tabs>
+        <w:ind w:left="4320" w:hanging="360"/>
+      </w:pPr>
+      <w:rPr>
+        <w:rFonts w:ascii="Wingdings" w:hAnsi="Wingdings" w:hint="default"/>
+        <w:sz w:val="20"/>
+      </w:rPr>
+    </w:lvl>
+    <w:lvl w:ilvl="6" w:tentative="1">
+      <w:start w:val="1"/>
+      <w:numFmt w:val="bullet"/>
+      <w:lvlText w:val=""/>
+      <w:lvlJc w:val="left"/>
+      <w:pPr>
+        <w:tabs>
+          <w:tab w:val="num" w:pos="5040"/>
+        </w:tabs>
+        <w:ind w:left="5040" w:hanging="360"/>
+      </w:pPr>
+      <w:rPr>
+        <w:rFonts w:ascii="Wingdings" w:hAnsi="Wingdings" w:hint="default"/>
+        <w:sz w:val="20"/>
+      </w:rPr>
+    </w:lvl>
+    <w:lvl w:ilvl="7" w:tentative="1">
+      <w:start w:val="1"/>
+      <w:numFmt w:val="bullet"/>
+      <w:lvlText w:val=""/>
+      <w:lvlJc w:val="left"/>
+      <w:pPr>
+        <w:tabs>
+          <w:tab w:val="num" w:pos="5760"/>
+        </w:tabs>
+        <w:ind w:left="5760" w:hanging="360"/>
+      </w:pPr>
+      <w:rPr>
+        <w:rFonts w:ascii="Wingdings" w:hAnsi="Wingdings" w:hint="default"/>
+        <w:sz w:val="20"/>
+      </w:rPr>
+    </w:lvl>
+    <w:lvl w:ilvl="8" w:tentative="1">
+      <w:start w:val="1"/>
+      <w:numFmt w:val="bullet"/>
+      <w:lvlText w:val=""/>
+      <w:lvlJc w:val="left"/>
+      <w:pPr>
+        <w:tabs>
+          <w:tab w:val="num" w:pos="6480"/>
+        </w:tabs>
+        <w:ind w:left="6480" w:hanging="360"/>
+      </w:pPr>
+      <w:rPr>
+        <w:rFonts w:ascii="Wingdings" w:hAnsi="Wingdings" w:hint="default"/>
+        <w:sz w:val="20"/>
+      </w:rPr>
+    </w:lvl>
+  </w:abstractNum>
+  <w:abstractNum w:abstractNumId="1" w15:restartNumberingAfterBreak="0">
+    <w:nsid w:val="3D1D3308"/>
+    <w:multiLevelType w:val="multilevel"/>
+    <w:tmpl w:val="EFD68216"/>
+    <w:lvl w:ilvl="0">
+      <w:start w:val="1"/>
+      <w:numFmt w:val="bullet"/>
+      <w:lvlText w:val=""/>
+      <w:lvlJc w:val="left"/>
+      <w:pPr>
+        <w:tabs>
+          <w:tab w:val="num" w:pos="720"/>
+        </w:tabs>
+        <w:ind w:left="720" w:hanging="360"/>
+      </w:pPr>
+      <w:rPr>
+        <w:rFonts w:ascii="Symbol" w:hAnsi="Symbol" w:hint="default"/>
+        <w:sz w:val="20"/>
+      </w:rPr>
+    </w:lvl>
+    <w:lvl w:ilvl="1" w:tentative="1">
+      <w:start w:val="1"/>
+      <w:numFmt w:val="bullet"/>
+      <w:lvlText w:val="o"/>
+      <w:lvlJc w:val="left"/>
+      <w:pPr>
+        <w:tabs>
+          <w:tab w:val="num" w:pos="1440"/>
+        </w:tabs>
+        <w:ind w:left="1440" w:hanging="360"/>
+      </w:pPr>
+      <w:rPr>
+        <w:rFonts w:ascii="Courier New" w:hAnsi="Courier New" w:hint="default"/>
+        <w:sz w:val="20"/>
+      </w:rPr>
+    </w:lvl>
+    <w:lvl w:ilvl="2" w:tentative="1">
+      <w:start w:val="1"/>
+      <w:numFmt w:val="bullet"/>
+      <w:lvlText w:val=""/>
+      <w:lvlJc w:val="left"/>
+      <w:pPr>
+        <w:tabs>
+          <w:tab w:val="num" w:pos="2160"/>
+        </w:tabs>
+        <w:ind w:left="2160" w:hanging="360"/>
+      </w:pPr>
+      <w:rPr>
+        <w:rFonts w:ascii="Wingdings" w:hAnsi="Wingdings" w:hint="default"/>
+        <w:sz w:val="20"/>
+      </w:rPr>
+    </w:lvl>
+    <w:lvl w:ilvl="3" w:tentative="1">
+      <w:start w:val="1"/>
+      <w:numFmt w:val="bullet"/>
+      <w:lvlText w:val=""/>
+      <w:lvlJc w:val="left"/>
+      <w:pPr>
+        <w:tabs>
+          <w:tab w:val="num" w:pos="2880"/>
+        </w:tabs>
+        <w:ind w:left="2880" w:hanging="360"/>
+      </w:pPr>
+      <w:rPr>
+        <w:rFonts w:ascii="Wingdings" w:hAnsi="Wingdings" w:hint="default"/>
+        <w:sz w:val="20"/>
+      </w:rPr>
+    </w:lvl>
+    <w:lvl w:ilvl="4" w:tentative="1">
+      <w:start w:val="1"/>
+      <w:numFmt w:val="bullet"/>
+      <w:lvlText w:val=""/>
+      <w:lvlJc w:val="left"/>
+      <w:pPr>
+        <w:tabs>
+          <w:tab w:val="num" w:pos="3600"/>
+        </w:tabs>
+        <w:ind w:left="3600" w:hanging="360"/>
+      </w:pPr>
+      <w:rPr>
+        <w:rFonts w:ascii="Wingdings" w:hAnsi="Wingdings" w:hint="default"/>
+        <w:sz w:val="20"/>
+      </w:rPr>
+    </w:lvl>
+    <w:lvl w:ilvl="5" w:tentative="1">
+      <w:start w:val="1"/>
+      <w:numFmt w:val="bullet"/>
+      <w:lvlText w:val=""/>
+      <w:lvlJc w:val="left"/>
+      <w:pPr>
+        <w:tabs>
+          <w:tab w:val="num" w:pos="4320"/>
+        </w:tabs>
+        <w:ind w:left="4320" w:hanging="360"/>
+      </w:pPr>
+      <w:rPr>
+        <w:rFonts w:ascii="Wingdings" w:hAnsi="Wingdings" w:hint="default"/>
+        <w:sz w:val="20"/>
+      </w:rPr>
+    </w:lvl>
+    <w:lvl w:ilvl="6" w:tentative="1">
+      <w:start w:val="1"/>
+      <w:numFmt w:val="bullet"/>
+      <w:lvlText w:val=""/>
+      <w:lvlJc w:val="left"/>
+      <w:pPr>
+        <w:tabs>
+          <w:tab w:val="num" w:pos="5040"/>
+        </w:tabs>
+        <w:ind w:left="5040" w:hanging="360"/>
+      </w:pPr>
+      <w:rPr>
+        <w:rFonts w:ascii="Wingdings" w:hAnsi="Wingdings" w:hint="default"/>
+        <w:sz w:val="20"/>
+      </w:rPr>
+    </w:lvl>
+    <w:lvl w:ilvl="7" w:tentative="1">
+      <w:start w:val="1"/>
+      <w:numFmt w:val="bullet"/>
+      <w:lvlText w:val=""/>
+      <w:lvlJc w:val="left"/>
+      <w:pPr>
+        <w:tabs>
+          <w:tab w:val="num" w:pos="5760"/>
+        </w:tabs>
+        <w:ind w:left="5760" w:hanging="360"/>
+      </w:pPr>
+      <w:rPr>
+        <w:rFonts w:ascii="Wingdings" w:hAnsi="Wingdings" w:hint="default"/>
+        <w:sz w:val="20"/>
+      </w:rPr>
+    </w:lvl>
+    <w:lvl w:ilvl="8" w:tentative="1">
+      <w:start w:val="1"/>
+      <w:numFmt w:val="bullet"/>
+      <w:lvlText w:val=""/>
+      <w:lvlJc w:val="left"/>
+      <w:pPr>
+        <w:tabs>
+          <w:tab w:val="num" w:pos="6480"/>
+        </w:tabs>
+        <w:ind w:left="6480" w:hanging="360"/>
+      </w:pPr>
+      <w:rPr>
+        <w:rFonts w:ascii="Wingdings" w:hAnsi="Wingdings" w:hint="default"/>
+        <w:sz w:val="20"/>
+      </w:rPr>
+    </w:lvl>
+  </w:abstractNum>
+  <w:num w:numId="1" w16cid:durableId="1031340920">
+    <w:abstractNumId w:val="0"/>
+  </w:num>
+  <w:num w:numId="2" w16cid:durableId="1984694168">
+    <w:abstractNumId w:val="1"/>
+  </w:num>
+</w:numbering>
 </file>
 
 <file path=word/styles.xml><?xml version="1.0" encoding="utf-8"?>

</xml_diff>

<commit_message>
Actualización datos en bitacora incluyendo detalles de EJ-5 y EJ-6
</commit_message>
<xml_diff>
--- a/Bitacora/5.6 Bitácora de desarrollo.docx
+++ b/Bitacora/5.6 Bitácora de desarrollo.docx
@@ -519,6 +519,7 @@
       <w:r>
         <w:rPr>
           <w:rFonts w:ascii="Times New Roman" w:hAnsi="Times New Roman" w:cs="Times New Roman"/>
+          <w:noProof/>
         </w:rPr>
         <w:drawing>
           <wp:anchor distT="0" distB="0" distL="114300" distR="114300" simplePos="0" relativeHeight="251659264" behindDoc="0" locked="0" layoutInCell="1" allowOverlap="1" wp14:anchorId="5EDAB565" wp14:editId="1E4EA3AB">
@@ -618,6 +619,197 @@
           <w:rFonts w:ascii="Times New Roman" w:hAnsi="Times New Roman" w:cs="Times New Roman"/>
         </w:rPr>
       </w:pPr>
+    </w:p>
+    <w:p>
+      <w:pPr>
+        <w:rPr>
+          <w:rFonts w:ascii="Times New Roman" w:hAnsi="Times New Roman" w:cs="Times New Roman"/>
+        </w:rPr>
+      </w:pPr>
+      <w:r>
+        <w:rPr>
+          <w:rFonts w:ascii="Times New Roman" w:hAnsi="Times New Roman" w:cs="Times New Roman"/>
+          <w:b/>
+          <w:bCs/>
+        </w:rPr>
+        <w:t>Día 7 – 02-09-2026</w:t>
+      </w:r>
+    </w:p>
+    <w:p>
+      <w:pPr>
+        <w:rPr>
+          <w:rFonts w:ascii="Times New Roman" w:hAnsi="Times New Roman" w:cs="Times New Roman"/>
+        </w:rPr>
+      </w:pPr>
+      <w:r>
+        <w:rPr>
+          <w:rFonts w:ascii="Times New Roman" w:hAnsi="Times New Roman" w:cs="Times New Roman"/>
+          <w:b/>
+          <w:bCs/>
+        </w:rPr>
+        <w:t>Avance:</w:t>
+      </w:r>
+      <w:r>
+        <w:rPr>
+          <w:rFonts w:ascii="Times New Roman" w:hAnsi="Times New Roman" w:cs="Times New Roman"/>
+        </w:rPr>
+        <w:br/>
+        <w:t xml:space="preserve">Se finalizó el punto 5, </w:t>
+      </w:r>
+      <w:r>
+        <w:rPr>
+          <w:rFonts w:ascii="Times New Roman" w:hAnsi="Times New Roman" w:cs="Times New Roman"/>
+          <w:b/>
+          <w:bCs/>
+        </w:rPr>
+        <w:t>detección de referencias circulares</w:t>
+      </w:r>
+      <w:r>
+        <w:rPr>
+          <w:rFonts w:ascii="Times New Roman" w:hAnsi="Times New Roman" w:cs="Times New Roman"/>
+        </w:rPr>
+        <w:t>, utilizando como ejemplo la dependencia A1 → B2 → C3 → A1.</w:t>
+      </w:r>
+    </w:p>
+    <w:p>
+      <w:pPr>
+        <w:rPr>
+          <w:rFonts w:ascii="Times New Roman" w:hAnsi="Times New Roman" w:cs="Times New Roman"/>
+        </w:rPr>
+      </w:pPr>
+      <w:r>
+        <w:rPr>
+          <w:rFonts w:ascii="Times New Roman" w:hAnsi="Times New Roman" w:cs="Times New Roman"/>
+          <w:b/>
+          <w:bCs/>
+        </w:rPr>
+        <w:t>Problema encontrado:</w:t>
+      </w:r>
+      <w:r>
+        <w:rPr>
+          <w:rFonts w:ascii="Times New Roman" w:hAnsi="Times New Roman" w:cs="Times New Roman"/>
+        </w:rPr>
+        <w:br/>
+        <w:t>Era necesario identificar cuando una celda volvía a depender de sí misma mediante una cadena de dependencias.</w:t>
+      </w:r>
+    </w:p>
+    <w:p>
+      <w:pPr>
+        <w:rPr>
+          <w:rFonts w:ascii="Times New Roman" w:hAnsi="Times New Roman" w:cs="Times New Roman"/>
+        </w:rPr>
+      </w:pPr>
+      <w:r>
+        <w:rPr>
+          <w:rFonts w:ascii="Times New Roman" w:hAnsi="Times New Roman" w:cs="Times New Roman"/>
+          <w:b/>
+          <w:bCs/>
+        </w:rPr>
+        <w:t>Decisión y solución:</w:t>
+      </w:r>
+      <w:r>
+        <w:rPr>
+          <w:rFonts w:ascii="Times New Roman" w:hAnsi="Times New Roman" w:cs="Times New Roman"/>
+        </w:rPr>
+        <w:br/>
+        <w:t xml:space="preserve">Se implementó </w:t>
+      </w:r>
+      <w:proofErr w:type="spellStart"/>
+      <w:r>
+        <w:rPr>
+          <w:rFonts w:ascii="Times New Roman" w:hAnsi="Times New Roman" w:cs="Times New Roman"/>
+        </w:rPr>
+        <w:t>DetectarReferenciaCircular</w:t>
+      </w:r>
+      <w:proofErr w:type="spellEnd"/>
+      <w:r>
+        <w:rPr>
+          <w:rFonts w:ascii="Times New Roman" w:hAnsi="Times New Roman" w:cs="Times New Roman"/>
+        </w:rPr>
+        <w:t xml:space="preserve"> para recorrer las dependencias y comprobar si </w:t>
+      </w:r>
+      <w:r>
+        <w:rPr>
+          <w:rFonts w:ascii="Times New Roman" w:hAnsi="Times New Roman" w:cs="Times New Roman"/>
+        </w:rPr>
+        <w:lastRenderedPageBreak/>
+        <w:t>la cadena regresaba a la celda inicial. De esta forma, el sistema puede detectar y señalar una referencia circular.</w:t>
+      </w:r>
+    </w:p>
+    <w:p>
+      <w:pPr>
+        <w:rPr>
+          <w:rFonts w:ascii="Times New Roman" w:hAnsi="Times New Roman" w:cs="Times New Roman"/>
+        </w:rPr>
+      </w:pPr>
+      <w:r>
+        <w:rPr>
+          <w:rFonts w:ascii="Times New Roman" w:hAnsi="Times New Roman" w:cs="Times New Roman"/>
+          <w:b/>
+          <w:bCs/>
+        </w:rPr>
+        <w:t>Nota:</w:t>
+      </w:r>
+      <w:r>
+        <w:rPr>
+          <w:rFonts w:ascii="Times New Roman" w:hAnsi="Times New Roman" w:cs="Times New Roman"/>
+        </w:rPr>
+        <w:br/>
+        <w:t>Con este avance se completaron los cinco algoritmos requeridos. Además, se finalizó el diseño de la estructura de datos, definiendo la representación de las celdas, fórmulas, tokens y dependencias dentro de la hoja de cálculo</w:t>
+      </w:r>
+      <w:r>
+        <w:rPr>
+          <w:rFonts w:ascii="Times New Roman" w:hAnsi="Times New Roman" w:cs="Times New Roman"/>
+        </w:rPr>
+        <w:drawing>
+          <wp:inline distT="0" distB="0" distL="0" distR="0" wp14:anchorId="4910AB29" wp14:editId="0989571A">
+            <wp:extent cx="5612130" cy="1278890"/>
+            <wp:effectExtent l="0" t="0" r="7620" b="0"/>
+            <wp:docPr id="1958094791" name="Imagen 2"/>
+            <wp:cNvGraphicFramePr>
+              <a:graphicFrameLocks xmlns:a="http://schemas.openxmlformats.org/drawingml/2006/main" noChangeAspect="1"/>
+            </wp:cNvGraphicFramePr>
+            <a:graphic xmlns:a="http://schemas.openxmlformats.org/drawingml/2006/main">
+              <a:graphicData uri="http://schemas.openxmlformats.org/drawingml/2006/picture">
+                <pic:pic xmlns:pic="http://schemas.openxmlformats.org/drawingml/2006/picture">
+                  <pic:nvPicPr>
+                    <pic:cNvPr id="0" name="Picture 6"/>
+                    <pic:cNvPicPr>
+                      <a:picLocks noChangeAspect="1" noChangeArrowheads="1"/>
+                    </pic:cNvPicPr>
+                  </pic:nvPicPr>
+                  <pic:blipFill>
+                    <a:blip r:embed="rId8" cstate="print">
+                      <a:extLst>
+                        <a:ext uri="{28A0092B-C50C-407E-A947-70E740481C1C}">
+                          <a14:useLocalDpi xmlns:a14="http://schemas.microsoft.com/office/drawing/2010/main" val="0"/>
+                        </a:ext>
+                      </a:extLst>
+                    </a:blip>
+                    <a:srcRect/>
+                    <a:stretch>
+                      <a:fillRect/>
+                    </a:stretch>
+                  </pic:blipFill>
+                  <pic:spPr bwMode="auto">
+                    <a:xfrm>
+                      <a:off x="0" y="0"/>
+                      <a:ext cx="5612130" cy="1278890"/>
+                    </a:xfrm>
+                    <a:prstGeom prst="rect">
+                      <a:avLst/>
+                    </a:prstGeom>
+                    <a:noFill/>
+                    <a:ln>
+                      <a:noFill/>
+                    </a:ln>
+                  </pic:spPr>
+                </pic:pic>
+              </a:graphicData>
+            </a:graphic>
+          </wp:inline>
+        </w:drawing>
+      </w:r>
     </w:p>
     <w:p>
       <w:pPr>

</xml_diff>

<commit_message>
actualización bitacora, nivel 1 y nivel 2 completado
</commit_message>
<xml_diff>
--- a/Bitacora/5.6 Bitácora de desarrollo.docx
+++ b/Bitacora/5.6 Bitácora de desarrollo.docx
@@ -204,21 +204,7 @@
         <w:rPr>
           <w:rFonts w:ascii="Times New Roman" w:hAnsi="Times New Roman" w:cs="Times New Roman"/>
         </w:rPr>
-        <w:t>Proceso de análisis y diseño en 5.2 Diagramas de flujo (PSeInt</w:t>
-      </w:r>
-      <w:proofErr w:type="gramStart"/>
-      <w:r>
-        <w:rPr>
-          <w:rFonts w:ascii="Times New Roman" w:hAnsi="Times New Roman" w:cs="Times New Roman"/>
-        </w:rPr>
-        <w:t>)(</w:t>
-      </w:r>
-      <w:proofErr w:type="gramEnd"/>
-      <w:r>
-        <w:rPr>
-          <w:rFonts w:ascii="Times New Roman" w:hAnsi="Times New Roman" w:cs="Times New Roman"/>
-        </w:rPr>
-        <w:t>inciso 1 y 2)</w:t>
+        <w:t>Proceso de análisis y diseño en 5.2 Diagramas de flujo (PSeInt)(inciso 1 y 2)</w:t>
       </w:r>
     </w:p>
     <w:p>
@@ -368,21 +354,7 @@
         <w:rPr>
           <w:rFonts w:ascii="Times New Roman" w:hAnsi="Times New Roman" w:cs="Times New Roman"/>
         </w:rPr>
-        <w:t xml:space="preserve">Avance: Se trabajó en el punto 3, evaluación de la expresión </w:t>
-      </w:r>
-      <w:proofErr w:type="spellStart"/>
-      <w:r>
-        <w:rPr>
-          <w:rFonts w:ascii="Times New Roman" w:hAnsi="Times New Roman" w:cs="Times New Roman"/>
-        </w:rPr>
-        <w:t>tokenizada</w:t>
-      </w:r>
-      <w:proofErr w:type="spellEnd"/>
-      <w:r>
-        <w:rPr>
-          <w:rFonts w:ascii="Times New Roman" w:hAnsi="Times New Roman" w:cs="Times New Roman"/>
-        </w:rPr>
-        <w:t>.</w:t>
+        <w:t>Avance: Se trabajó en el punto 3, evaluación de la expresión tokenizada.</w:t>
       </w:r>
     </w:p>
     <w:p>
@@ -486,21 +458,7 @@
         <w:rPr>
           <w:rFonts w:ascii="Times New Roman" w:hAnsi="Times New Roman" w:cs="Times New Roman"/>
         </w:rPr>
-        <w:t xml:space="preserve">Decisión y solución: Se implementó </w:t>
-      </w:r>
-      <w:proofErr w:type="spellStart"/>
-      <w:r>
-        <w:rPr>
-          <w:rFonts w:ascii="Times New Roman" w:hAnsi="Times New Roman" w:cs="Times New Roman"/>
-        </w:rPr>
-        <w:t>PropagarCambios</w:t>
-      </w:r>
-      <w:proofErr w:type="spellEnd"/>
-      <w:r>
-        <w:rPr>
-          <w:rFonts w:ascii="Times New Roman" w:hAnsi="Times New Roman" w:cs="Times New Roman"/>
-        </w:rPr>
-        <w:t xml:space="preserve"> para recorrer las dependencias y recalcular las celdas en el orden correspondiente.</w:t>
+        <w:t>Decisión y solución: Se implementó PropagarCambios para recorrer las dependencias y recalcular las celdas en el orden correspondiente.</w:t>
       </w:r>
     </w:p>
     <w:p>
@@ -712,21 +670,7 @@
           <w:rFonts w:ascii="Times New Roman" w:hAnsi="Times New Roman" w:cs="Times New Roman"/>
         </w:rPr>
         <w:br/>
-        <w:t xml:space="preserve">Se implementó </w:t>
-      </w:r>
-      <w:proofErr w:type="spellStart"/>
-      <w:r>
-        <w:rPr>
-          <w:rFonts w:ascii="Times New Roman" w:hAnsi="Times New Roman" w:cs="Times New Roman"/>
-        </w:rPr>
-        <w:t>DetectarReferenciaCircular</w:t>
-      </w:r>
-      <w:proofErr w:type="spellEnd"/>
-      <w:r>
-        <w:rPr>
-          <w:rFonts w:ascii="Times New Roman" w:hAnsi="Times New Roman" w:cs="Times New Roman"/>
-        </w:rPr>
-        <w:t xml:space="preserve"> para recorrer las dependencias y comprobar si </w:t>
+        <w:t xml:space="preserve">Se implementó DetectarReferenciaCircular para recorrer las dependencias y comprobar si </w:t>
       </w:r>
       <w:r>
         <w:rPr>
@@ -824,14 +768,12 @@
         </w:rPr>
         <w:t xml:space="preserve">09 al 10 septiembre se avanza </w:t>
       </w:r>
-      <w:proofErr w:type="gramStart"/>
-      <w:r>
-        <w:rPr>
-          <w:rFonts w:ascii="Times New Roman" w:hAnsi="Times New Roman" w:cs="Times New Roman"/>
-        </w:rPr>
-        <w:t>con  nivel</w:t>
-      </w:r>
-      <w:proofErr w:type="gramEnd"/>
+      <w:r>
+        <w:rPr>
+          <w:rFonts w:ascii="Times New Roman" w:hAnsi="Times New Roman" w:cs="Times New Roman"/>
+        </w:rPr>
+        <w:t>con nivel</w:t>
+      </w:r>
       <w:r>
         <w:rPr>
           <w:rFonts w:ascii="Times New Roman" w:hAnsi="Times New Roman" w:cs="Times New Roman"/>
@@ -1122,13 +1064,142 @@
           <w:rFonts w:ascii="Times New Roman" w:hAnsi="Times New Roman" w:cs="Times New Roman"/>
         </w:rPr>
       </w:pPr>
-    </w:p>
-    <w:p>
-      <w:pPr>
-        <w:rPr>
-          <w:rFonts w:ascii="Times New Roman" w:hAnsi="Times New Roman" w:cs="Times New Roman"/>
-        </w:rPr>
-      </w:pPr>
+      <w:r>
+        <w:rPr>
+          <w:rFonts w:ascii="Times New Roman" w:hAnsi="Times New Roman" w:cs="Times New Roman"/>
+        </w:rPr>
+        <w:lastRenderedPageBreak/>
+        <w:drawing>
+          <wp:anchor distT="0" distB="0" distL="114300" distR="114300" simplePos="0" relativeHeight="251661312" behindDoc="0" locked="0" layoutInCell="1" allowOverlap="1" wp14:anchorId="0850277E" wp14:editId="68B33E99">
+            <wp:simplePos x="0" y="0"/>
+            <wp:positionH relativeFrom="column">
+              <wp:posOffset>2216</wp:posOffset>
+            </wp:positionH>
+            <wp:positionV relativeFrom="paragraph">
+              <wp:posOffset>389</wp:posOffset>
+            </wp:positionV>
+            <wp:extent cx="3268849" cy="1080000"/>
+            <wp:effectExtent l="0" t="0" r="8255" b="6350"/>
+            <wp:wrapTopAndBottom/>
+            <wp:docPr id="1459955918" name="Imagen 1"/>
+            <wp:cNvGraphicFramePr>
+              <a:graphicFrameLocks xmlns:a="http://schemas.openxmlformats.org/drawingml/2006/main" noChangeAspect="1"/>
+            </wp:cNvGraphicFramePr>
+            <a:graphic xmlns:a="http://schemas.openxmlformats.org/drawingml/2006/main">
+              <a:graphicData uri="http://schemas.openxmlformats.org/drawingml/2006/picture">
+                <pic:pic xmlns:pic="http://schemas.openxmlformats.org/drawingml/2006/picture">
+                  <pic:nvPicPr>
+                    <pic:cNvPr id="1459955918" name=""/>
+                    <pic:cNvPicPr/>
+                  </pic:nvPicPr>
+                  <pic:blipFill>
+                    <a:blip r:embed="rId13" cstate="print">
+                      <a:extLst>
+                        <a:ext uri="{28A0092B-C50C-407E-A947-70E740481C1C}">
+                          <a14:useLocalDpi xmlns:a14="http://schemas.microsoft.com/office/drawing/2010/main" val="0"/>
+                        </a:ext>
+                      </a:extLst>
+                    </a:blip>
+                    <a:stretch>
+                      <a:fillRect/>
+                    </a:stretch>
+                  </pic:blipFill>
+                  <pic:spPr>
+                    <a:xfrm>
+                      <a:off x="0" y="0"/>
+                      <a:ext cx="3268849" cy="1080000"/>
+                    </a:xfrm>
+                    <a:prstGeom prst="rect">
+                      <a:avLst/>
+                    </a:prstGeom>
+                  </pic:spPr>
+                </pic:pic>
+              </a:graphicData>
+            </a:graphic>
+          </wp:anchor>
+        </w:drawing>
+      </w:r>
+    </w:p>
+    <w:p>
+      <w:pPr>
+        <w:rPr>
+          <w:rFonts w:ascii="Times New Roman" w:hAnsi="Times New Roman" w:cs="Times New Roman"/>
+        </w:rPr>
+      </w:pPr>
+      <w:r>
+        <w:rPr>
+          <w:rFonts w:ascii="Times New Roman" w:hAnsi="Times New Roman" w:cs="Times New Roman"/>
+        </w:rPr>
+        <w:t>Ya permite escribir caracteres en celda se completa el Nivel 1 y 2</w:t>
+      </w:r>
+    </w:p>
+    <w:p>
+      <w:pPr>
+        <w:rPr>
+          <w:rFonts w:ascii="Times New Roman" w:hAnsi="Times New Roman" w:cs="Times New Roman"/>
+        </w:rPr>
+      </w:pPr>
+      <w:r>
+        <w:rPr>
+          <w:noProof/>
+        </w:rPr>
+        <w:drawing>
+          <wp:anchor distT="0" distB="0" distL="114300" distR="114300" simplePos="0" relativeHeight="251662336" behindDoc="0" locked="0" layoutInCell="1" allowOverlap="1" wp14:anchorId="46ABEF15" wp14:editId="3614C227">
+            <wp:simplePos x="0" y="0"/>
+            <wp:positionH relativeFrom="column">
+              <wp:posOffset>2216</wp:posOffset>
+            </wp:positionH>
+            <wp:positionV relativeFrom="paragraph">
+              <wp:posOffset>-700</wp:posOffset>
+            </wp:positionV>
+            <wp:extent cx="5612130" cy="1887220"/>
+            <wp:effectExtent l="0" t="0" r="7620" b="0"/>
+            <wp:wrapTopAndBottom/>
+            <wp:docPr id="1852551074" name="Imagen 3" descr="Vista previa de la exportación de imagen"/>
+            <wp:cNvGraphicFramePr>
+              <a:graphicFrameLocks xmlns:a="http://schemas.openxmlformats.org/drawingml/2006/main" noChangeAspect="1"/>
+            </wp:cNvGraphicFramePr>
+            <a:graphic xmlns:a="http://schemas.openxmlformats.org/drawingml/2006/main">
+              <a:graphicData uri="http://schemas.openxmlformats.org/drawingml/2006/picture">
+                <pic:pic xmlns:pic="http://schemas.openxmlformats.org/drawingml/2006/picture">
+                  <pic:nvPicPr>
+                    <pic:cNvPr id="0" name="Picture 19" descr="Vista previa de la exportación de imagen"/>
+                    <pic:cNvPicPr>
+                      <a:picLocks noChangeAspect="1" noChangeArrowheads="1"/>
+                    </pic:cNvPicPr>
+                  </pic:nvPicPr>
+                  <pic:blipFill>
+                    <a:blip r:embed="rId14" cstate="print">
+                      <a:extLst>
+                        <a:ext uri="{28A0092B-C50C-407E-A947-70E740481C1C}">
+                          <a14:useLocalDpi xmlns:a14="http://schemas.microsoft.com/office/drawing/2010/main" val="0"/>
+                        </a:ext>
+                      </a:extLst>
+                    </a:blip>
+                    <a:srcRect/>
+                    <a:stretch>
+                      <a:fillRect/>
+                    </a:stretch>
+                  </pic:blipFill>
+                  <pic:spPr bwMode="auto">
+                    <a:xfrm>
+                      <a:off x="0" y="0"/>
+                      <a:ext cx="5612130" cy="1887220"/>
+                    </a:xfrm>
+                    <a:prstGeom prst="rect">
+                      <a:avLst/>
+                    </a:prstGeom>
+                    <a:noFill/>
+                    <a:ln>
+                      <a:noFill/>
+                    </a:ln>
+                  </pic:spPr>
+                </pic:pic>
+              </a:graphicData>
+            </a:graphic>
+          </wp:anchor>
+        </w:drawing>
+      </w:r>
     </w:p>
     <w:sectPr>
       <w:pgSz w:w="12240" w:h="15840"/>

</xml_diff>